<commit_message>
Complete Q1 Campaign Team Tracking assessment
</commit_message>
<xml_diff>
--- a/Q1_Campaign_Team_Tracking/docs/Q1_Technical_Response.docx
+++ b/Q1_Campaign_Team_Tracking/docs/Q1_Technical_Response.docx
@@ -452,6 +452,140 @@
         <w:t>Operational recommendation. Present the reconciled GPS and e-tally product to the Incident Manager. Use disagreement and raw spatial-screening patterns to prioritize rapid verification, not automatic mop-up conclusions.</w:t>
       </w:r>
     </w:p>
+    <w:p>
+      <w:r>
+        <w:br w:type="page"/>
+      </w:r>
+    </w:p>
+    <w:p>
+      <w:pPr>
+        <w:pStyle w:val="Heading1"/>
+      </w:pPr>
+      <w:r>
+        <w:t>Requirement 6: Evidence-Based Decision Products</w:t>
+      </w:r>
+    </w:p>
+    <w:p>
+      <w:r>
+        <w:t>Guiding principle: absence of GPS evidence is not evidence of operational failure. A settlement without a confirmed GPS track may have been genuinely missed, visited with a logger failure or non-use, affected by signal loss, subject to attribution uncertainty, or affected by reporting, identifier, timing, or processing mismatch.</w:t>
+      </w:r>
+    </w:p>
+    <w:p>
+      <w:pPr>
+        <w:pStyle w:val="Heading2"/>
+      </w:pPr>
+      <w:r>
+        <w:t>Observed evidence, inference, and confidence</w:t>
+      </w:r>
+    </w:p>
+    <w:p>
+      <w:r>
+        <w:t>The final products separate what the datasets directly show from operational inference. The technical map shows observed evidence classes; the Incident Manager brief converts them into verification priorities. Neither product treats missing GPS evidence as proof that a settlement was not visited.</w:t>
+      </w:r>
+    </w:p>
+    <w:p>
+      <w:pPr>
+        <w:pStyle w:val="ListBullet"/>
+      </w:pPr>
+      <w:r>
+        <w:t>High confidence: GPS and e-tally corroborate a recorded visit, or a directly measured source metric is reported within its own scope.</w:t>
+      </w:r>
+    </w:p>
+    <w:p>
+      <w:pPr>
+        <w:pStyle w:val="ListBullet"/>
+      </w:pPr>
+      <w:r>
+        <w:t>Moderate confidence: one source provides evidence while the other is unavailable or ambiguous.</w:t>
+      </w:r>
+    </w:p>
+    <w:p>
+      <w:pPr>
+        <w:pStyle w:val="ListBullet"/>
+      </w:pPr>
+      <w:r>
+        <w:t>Low confidence: sources disagree, attribution is ambiguous, material GPS QA concerns apply, or identifiers are unmatched.</w:t>
+      </w:r>
+    </w:p>
+    <w:p>
+      <w:pPr>
+        <w:pStyle w:val="ListBullet"/>
+      </w:pPr>
+      <w:r>
+        <w:t>Unknown: available evidence is insufficient for an operational conclusion.</w:t>
+      </w:r>
+    </w:p>
+    <w:p>
+      <w:pPr>
+        <w:pStyle w:val="Heading2"/>
+      </w:pPr>
+      <w:r>
+        <w:t>Technical map and statistical interpretation</w:t>
+      </w:r>
+    </w:p>
+    <w:p>
+      <w:r>
+        <w:t>The A3 technical map presents planned settlement evidence classes, ward and LGA boundaries, inaccessible settlements, coordinate grid, projection, data sources, and method notes. The primary Global Moran result is significant (I=0.046612; expected I=-0.000420; z=4.821064; 999-permutation p=0.001), showing positive global spatial autocorrelation in the observed GPS-derived indicator.</w:t>
+      </w:r>
+    </w:p>
+    <w:p>
+      <w:r>
+        <w:t>No Local Moran finding survived Benjamini-Hochberg FDR correction. The map therefore does not portray exploratory Local Moran patterns as confirmed hotspots. This prevents an analytical screening signal from being presented as evidence of a genuine programme failure.</w:t>
+      </w:r>
+    </w:p>
+    <w:p>
+      <w:pPr>
+        <w:pStyle w:val="Heading2"/>
+      </w:pPr>
+      <w:r>
+        <w:t>Final operational recommendations</w:t>
+      </w:r>
+    </w:p>
+    <w:p>
+      <w:pPr>
+        <w:pStyle w:val="ListBullet"/>
+      </w:pPr>
+      <w:r>
+        <w:t>Priority 1: rapidly verify 1,639 e-tally-reported settlements without confirmed GPS visit evidence. This is low confidence for a conclusion of non-visit, but high priority for supervisor verification, device inspection, repeat-visit confirmation, and team/date/settlement reconciliation.</w:t>
+      </w:r>
+    </w:p>
+    <w:p>
+      <w:pPr>
+        <w:pStyle w:val="ListBullet"/>
+      </w:pPr>
+      <w:r>
+        <w:t>Priority 2: verify 529 settlements with neither confirmed GPS visit evidence nor e-tally report. Confirm access status, field records, device capture, and supervisory evidence before scheduling repeat visits.</w:t>
+      </w:r>
+    </w:p>
+    <w:p>
+      <w:pPr>
+        <w:pStyle w:val="ListBullet"/>
+      </w:pPr>
+      <w:r>
+        <w:t>Priority 3: resolve 180 ambiguous GPS-attribution cases before classifying them as visited or missed. Reconcile coordinates, movement context, and e-tally with supervisor records.</w:t>
+      </w:r>
+    </w:p>
+    <w:p>
+      <w:pPr>
+        <w:pStyle w:val="ListBullet"/>
+      </w:pPr>
+      <w:r>
+        <w:t>Reconcile seven unmatched e-tally identifiers separately. Do not treat them as planned-settlement performance evidence until identifiers are resolved.</w:t>
+      </w:r>
+    </w:p>
+    <w:p>
+      <w:pPr>
+        <w:pStyle w:val="Heading2"/>
+      </w:pPr>
+      <w:r>
+        <w:t>Assessment reflection</w:t>
+      </w:r>
+    </w:p>
+    <w:p>
+      <w:r>
+        <w:t>This assessment deliberately avoids conflating a data artefact with a programme failure. GPS is stronger evidence of physical presence; e-tally is stronger evidence of reported service delivery and doses. Neither alone establishes both physical arrival and vaccination. The reconciled product and confidence framework make uncertainty explicit and direct the Incident Manager toward rapid verification rather than unsupported disciplinary or mop-up decisions.</w:t>
+      </w:r>
+    </w:p>
     <w:sectPr>
       <w:footerReference w:type="default" r:id="rId9"/>
       <w:pgSz w:w="12240" w:h="15840"/>

</xml_diff>